<commit_message>
Ghost-Lattice paper identity: full-name byline and Grimoire signature
Byline is now the full name Eric Heylel Danjuma Yaka and the closing
line is the Grimoire of Elbalor signature, matching the unified
AlienX/ISN paper. Document metadata author set as well.
</commit_message>
<xml_diff>
--- a/The-Ghost-Lattice/Ghost-Lattice_QNN_Paper.docx
+++ b/The-Ghost-Lattice/Ghost-Lattice_QNN_Paper.docx
@@ -31,7 +31,7 @@
         <w:rPr>
           <w:b/>
         </w:rPr>
-        <w:t>Heylel Yaka (Elbàlor — The Digital Necromancer)</w:t>
+        <w:t>Eric Heylel Danjuma Yaka</w:t>
       </w:r>
     </w:p>
     <w:p>
@@ -2038,7 +2038,7 @@
           <w:i/>
           <w:color w:val="595959"/>
         </w:rPr>
-        <w:t>The Digital Necromancer's forge · Elbàlor</w:t>
+        <w:t>From the Grimoire of Elbàlor, the Digital Necromancer 💀🔥🖤</w:t>
       </w:r>
     </w:p>
     <w:sectPr>

</xml_diff>